<commit_message>
fix: finalize verified capstone submission
</commit_message>
<xml_diff>
--- a/submission/SentinelNet_Capstone_Report.docx
+++ b/submission/SentinelNet_Capstone_Report.docx
@@ -77,6 +77,19 @@
           <w:sz w:val="21"/>
         </w:rPr>
         <w:t>AI Driven Cybersecurity and Digital Forensics Fellowship</w:t>
+      </w:r>
+    </w:p>
+    <w:p>
+      <w:pPr>
+        <w:spacing w:before="180"/>
+        <w:jc w:val="center"/>
+      </w:pPr>
+      <w:r>
+        <w:rPr>
+          <w:b/>
+          <w:sz w:val="21"/>
+        </w:rPr>
+        <w:t>Student: ijudigal jarafu | Registration No: 2026/AICDF/16789</w:t>
       </w:r>
     </w:p>
     <w:p>
@@ -169,7 +182,7 @@
     </w:p>
     <w:p>
       <w:r>
-        <w:t>The final run generated 12,000 deterministic synthetic flows and processed 1,000 flows through the streaming detector. It produced 384 alerts at the configured medium threshold of 65. The supervised classifier achieved macro F1 0.9987, the autoencoder anomaly detector achieved macro F1 0.9595, the Isolation Forest achieved macro F1 0.7942, and the sequence GRU achieved macro F1 0.1223. The low GRU result is retained and explained because the synthetic labels do not contain realistic campaign-level temporal dependence.</w:t>
+        <w:t>The final run generated 12,000 deterministic synthetic flows and processed the first 1,000 flows through an end-to-end streaming integration demonstration. It produced 384 alerts at the configured medium threshold of 65. This stream overlaps the model-development corpus and is not an independent evaluation set. Held-out model results were: supervised macro F1 0.9987, autoencoder anomaly macro F1 0.9595, Isolation Forest macro F1 0.7942, and sequence GRU macro F1 0.1223. The low GRU result is retained and explained because the synthetic labels do not contain realistic campaign-level temporal dependence.</w:t>
       </w:r>
     </w:p>
     <w:p>
@@ -541,7 +554,7 @@
                 <w:color w:val="000000"/>
                 <w:sz w:val="17"/>
               </w:rPr>
-              <w:t>33 automated tests and deliverable consistency validation</w:t>
+              <w:t>38 automated tests and deliverable consistency validation</w:t>
             </w:r>
           </w:p>
         </w:tc>
@@ -1109,7 +1122,7 @@
     </w:p>
     <w:p>
       <w:r>
-        <w:t>Fourteen numeric features feed all three neural model paths. The split occurs before preprocessing. Missing numeric values are imputed from the training partition and the scaler is fitted on training rows only, preventing test statistics from leaking into model training.</w:t>
+        <w:t>Fourteen numeric features feed all three neural model paths. Inputs with missing or non-finite required features are rejected before splitting. The split occurs before preprocessing and the scaler is fitted on training rows only, preventing test statistics from leaking into model training.</w:t>
       </w:r>
     </w:p>
     <w:tbl>
@@ -3192,7 +3205,7 @@
     </w:p>
     <w:p>
       <w:r>
-        <w:t>The streaming detector processed 1,000 flows and emitted 384 alerts at risk score 65 or higher. The 100-point formula is supervised 45, anomaly 20, sequence 10, telemetry 10, sensor 5, and asset criticality 10. The stored component values must sum to the displayed score; the validator checks this invariant.</w:t>
+        <w:t>The streaming integration demonstration processed 1,000 flows and emitted 384 alerts at risk score 65 or higher. These rows overlap the model-development corpus, so the alert count demonstrates integration behavior rather than independent generalization. The 100-point formula is supervised 45, anomaly 20, sequence 10, telemetry 10, sensor 5, and asset criticality 10. The stored component values must sum to the displayed score; the validator checks this invariant.</w:t>
       </w:r>
     </w:p>
     <w:tbl>

</xml_diff>